<commit_message>
Phase 2: remove the degenerate Model 1 calibrator, keep raw confidence
A teammate found the isotonic calibrator maps every raw score between 0.30 and 0.99 to 0.085.
Cause: 91% of out-of-fold windows scoring >= 0.9 are Normal windows of the Normal-only sessions 0 and 5.
- results/final: layer2 JSON regenerated with raw confidence (labels and counts unchanged), validation ok
- 12a kept as a documented negative result (flatness check added); calibrator moved to results/12a_idle_ambiguity/
- report, notes, README, status and decisions updated; future work #14 added
</commit_message>
<xml_diff>
--- a/phase2/docs/phase2_results.docx
+++ b/phase2/docs/phase2_results.docx
@@ -4979,36 +4979,7 @@
     <w:p/>
     <w:p>
       <w:r>
-        <w:t xml:space="preserve">Three reporting complements were added on 2026-10-15 without changing the schema: (a) the </w:t>
-      </w:r>
-      <w:r>
-        <w:rPr>
-          <w:rFonts w:ascii="Consolas" w:hAnsi="Consolas"/>
-          <w:sz w:val="18"/>
-        </w:rPr>
-        <w:t>confidence</w:t>
-      </w:r>
-      <w:r>
-        <w:t xml:space="preserve"> of Normal</w:t>
-      </w:r>
-    </w:p>
-    <w:p>
-      <w:r>
-        <w:t xml:space="preserve">windows is a </w:t>
-      </w:r>
-      <w:r>
-        <w:rPr>
-          <w:b/>
-        </w:rPr>
-        <w:t>calibrated</w:t>
-      </w:r>
-      <w:r>
-        <w:t xml:space="preserve"> probability (isotonic regression fitted on out-of-fold Model 1 probabilities; expected</w:t>
-      </w:r>
-    </w:p>
-    <w:p>
-      <w:r>
-        <w:t xml:space="preserve">calibration error 0.133 → 0.018 on the held-out sessions), (b) flagged windows with an </w:t>
+        <w:t xml:space="preserve">Two reporting complements were added on 2026-10-15 without changing the schema: (a) flagged windows with an </w:t>
       </w:r>
       <w:r>
         <w:rPr>
@@ -5047,7 +5018,7 @@
     </w:p>
     <w:p>
       <w:r>
-        <w:t xml:space="preserve">faults — a review queue with 90 % precision on false alarms), (c) </w:t>
+        <w:t xml:space="preserve">faults — a review queue with 90 % precision on false alarms), (b) </w:t>
       </w:r>
       <w:r>
         <w:rPr>
@@ -5090,6 +5061,27 @@
       </w:r>
       <w:r>
         <w:t>.</w:t>
+      </w:r>
+    </w:p>
+    <w:p>
+      <w:r>
+        <w:rPr>
+          <w:b/>
+        </w:rPr>
+        <w:t>A calibration that was tested and rejected (step 12a).</w:t>
+      </w:r>
+      <w:r>
+        <w:t xml:space="preserve"> An isotonic regression fitted on out-of-fold Model 1 probabilities lowered the calibration error (0.133 → 0.018 on the held-out sessions) but mapped every raw score between 0.30 and 0.99 to the same value (8.5 %): 2,908 of the 3,206 training windows scoring ≥ 0.9 are Normal windows of the two Normal-only sessions 0 and 5, so the map learned "a high score is usually a false alarm", which does not hold for other recordings. It erased the ranking information, was reported by a teammate and confirmed, and was removed. </w:t>
+      </w:r>
+      <w:r>
+        <w:rPr>
+          <w:rFonts w:ascii="Consolas" w:hAnsi="Consolas"/>
+          <w:sz w:val="18"/>
+        </w:rPr>
+        <w:t>confidence</w:t>
+      </w:r>
+      <w:r>
+        <w:t xml:space="preserve"> in the Layer 2 JSON is therefore the raw Model 1 probability for Normal windows and Model 2's probability for fault windows, as in Phase 1 (which labelled it uncalibrated); no label or count changed. Model 1's reliability is reported empirically instead (precision 0.70 at t = 0.5 on the held-out sessions).</w:t>
       </w:r>
     </w:p>
     <w:p>
@@ -5896,12 +5888,12 @@
     </w:p>
     <w:p>
       <w:r>
-        <w:t>PRB &lt; 1 %, &lt; 1 packet/sample) marks flagged windows whose only fault evidence is "no traffic", and Model 1's</w:t>
+        <w:t>PRB &lt; 1 %, &lt; 1 packet/sample) marks flagged windows whose only fault evidence is "no traffic", (an isotonic calibration of Model 1's</w:t>
       </w:r>
     </w:p>
     <w:p>
       <w:r>
-        <w:t>confidence is calibrated. On the held-out sessions the flag catches 45 of the 116 false alarms and touches</w:t>
+        <w:t>confidence was also tested and rejected, §8). On the held-out sessions the flag catches 45 of the 116 false alarms and touches</w:t>
       </w:r>
     </w:p>
     <w:p>

</xml_diff>

<commit_message>
Use the raw Model 1 probability as confidence; keep the isotonic calibrator as a rejected experiment
The isotonic calibrator mapped every raw score between 0.30 and 0.99 to the
same value (0.085), so it removed the ranking information.

- scripts/11_final_pipeline.py no longer applies a calibrator
- scripts/12a_idle_ambiguity.py keeps it as a documented negative result with
  a flatness check; the pickle is saved in results/12a_idle_ambiguity/
- Layer 2 JSON regenerated: labels and fault confidences are unchanged,
  Normal-window confidence is now the raw probability
- Report, README, STATUS, DECISIONS, PROJECT_STORY, future_work updated
</commit_message>
<xml_diff>
--- a/phase2/docs/phase2_results.docx
+++ b/phase2/docs/phase2_results.docx
@@ -4979,36 +4979,7 @@
     <w:p/>
     <w:p>
       <w:r>
-        <w:t xml:space="preserve">Three reporting complements were added on 2026-10-15 without changing the schema: (a) the </w:t>
-      </w:r>
-      <w:r>
-        <w:rPr>
-          <w:rFonts w:ascii="Consolas" w:hAnsi="Consolas"/>
-          <w:sz w:val="18"/>
-        </w:rPr>
-        <w:t>confidence</w:t>
-      </w:r>
-      <w:r>
-        <w:t xml:space="preserve"> of Normal</w:t>
-      </w:r>
-    </w:p>
-    <w:p>
-      <w:r>
-        <w:t xml:space="preserve">windows is a </w:t>
-      </w:r>
-      <w:r>
-        <w:rPr>
-          <w:b/>
-        </w:rPr>
-        <w:t>calibrated</w:t>
-      </w:r>
-      <w:r>
-        <w:t xml:space="preserve"> probability (isotonic regression fitted on out-of-fold Model 1 probabilities; expected</w:t>
-      </w:r>
-    </w:p>
-    <w:p>
-      <w:r>
-        <w:t xml:space="preserve">calibration error 0.133 → 0.018 on the held-out sessions), (b) flagged windows with an </w:t>
+        <w:t xml:space="preserve">Two reporting complements were added on 2026-10-15 without changing the schema: (a) flagged windows with an </w:t>
       </w:r>
       <w:r>
         <w:rPr>
@@ -5047,7 +5018,7 @@
     </w:p>
     <w:p>
       <w:r>
-        <w:t xml:space="preserve">faults — a review queue with 90 % precision on false alarms), (c) </w:t>
+        <w:t xml:space="preserve">faults — a review queue with 90 % precision on false alarms), (b) </w:t>
       </w:r>
       <w:r>
         <w:rPr>
@@ -5090,6 +5061,27 @@
       </w:r>
       <w:r>
         <w:t>.</w:t>
+      </w:r>
+    </w:p>
+    <w:p>
+      <w:r>
+        <w:rPr>
+          <w:b/>
+        </w:rPr>
+        <w:t>A calibration that was tested and rejected (step 12a).</w:t>
+      </w:r>
+      <w:r>
+        <w:t xml:space="preserve"> An isotonic regression fitted on out-of-fold Model 1 probabilities lowered the calibration error (0.133 → 0.018 on the held-out sessions) but mapped every raw score between 0.30 and 0.99 to the same value (8.5 %): 2,908 of the 3,206 training windows scoring ≥ 0.9 are Normal windows of the two Normal-only sessions 0 and 5, so the map learned "a high score is usually a false alarm", which does not hold for other recordings. It erased the ranking information, was reported by a teammate and confirmed, and was removed. </w:t>
+      </w:r>
+      <w:r>
+        <w:rPr>
+          <w:rFonts w:ascii="Consolas" w:hAnsi="Consolas"/>
+          <w:sz w:val="18"/>
+        </w:rPr>
+        <w:t>confidence</w:t>
+      </w:r>
+      <w:r>
+        <w:t xml:space="preserve"> in the Layer 2 JSON is therefore the raw Model 1 probability for Normal windows and Model 2's probability for fault windows, as in Phase 1 (which labelled it uncalibrated); no label or count changed. Model 1's reliability is reported empirically instead (precision 0.70 at t = 0.5 on the held-out sessions).</w:t>
       </w:r>
     </w:p>
     <w:p>
@@ -5896,12 +5888,12 @@
     </w:p>
     <w:p>
       <w:r>
-        <w:t>PRB &lt; 1 %, &lt; 1 packet/sample) marks flagged windows whose only fault evidence is "no traffic", and Model 1's</w:t>
+        <w:t>PRB &lt; 1 %, &lt; 1 packet/sample) marks flagged windows whose only fault evidence is "no traffic", (an isotonic calibration of Model 1's</w:t>
       </w:r>
     </w:p>
     <w:p>
       <w:r>
-        <w:t>confidence is calibrated. On the held-out sessions the flag catches 45 of the 116 false alarms and touches</w:t>
+        <w:t>confidence was also tested and rejected, §8). On the held-out sessions the flag catches 45 of the 116 false alarms and touches</w:t>
       </w:r>
     </w:p>
     <w:p>

</xml_diff>